<commit_message>
Add Group 2 title-page labeling, team-member placeholder, and a section tying the FastAPI/React tool to the honest-benchmark findings
Co-Authored-By: Claude Sonnet 5 <noreply@anthropic.com>
Claude-Session: https://claude.ai/code/session_018bJGGE565k5p89XXbVeEsb
</commit_message>
<xml_diff>
--- a/pyrolysis_advisor/docs/BioOil_Pyrolysis_Advisor_Report.docx
+++ b/pyrolysis_advisor/docs/BioOil_Pyrolysis_Advisor_Report.docx
@@ -39,10 +39,40 @@
         <w:rPr>
           <w:b/>
           <w:bCs/>
+          <w:sz w:val="22"/>
+          <w:szCs w:val="22"/>
+          <w:color w:val="1F4E79"/>
+        </w:rPr>
+        <w:t xml:space="preserve">Group 2</w:t>
+      </w:r>
+    </w:p>
+    <w:p>
+      <w:pPr>
+        <w:jc w:val="center"/>
+      </w:pPr>
+      <w:r>
+        <w:rPr>
+          <w:b/>
+          <w:bCs/>
           <w:sz w:val="24"/>
           <w:szCs w:val="24"/>
         </w:rPr>
         <w:t xml:space="preserve">Umasuthan Palaniappan (CB.AI.U4AIM25041)</w:t>
+      </w:r>
+    </w:p>
+    <w:p>
+      <w:pPr>
+        <w:jc w:val="center"/>
+      </w:pPr>
+      <w:r>
+        <w:rPr>
+          <w:i/>
+          <w:iCs/>
+          <w:sz w:val="20"/>
+          <w:szCs w:val="20"/>
+          <w:color w:val="808080"/>
+        </w:rPr>
+        <w:t xml:space="preserve">Team members: [Add team member names here]</w:t>
       </w:r>
     </w:p>
     <w:p>
@@ -4783,6 +4813,97 @@
       </w:pPr>
       <w:r>
         <w:t xml:space="preserve">No separation data was available, so the separation stage itself is discussed, not modelled.</w:t>
+      </w:r>
+    </w:p>
+    <w:p>
+      <w:pPr>
+        <w:pStyle w:val="Heading2"/>
+      </w:pPr>
+      <w:r>
+        <w:t xml:space="preserve">6.3 Supporting engineering: a deployable prediction tool</w:t>
+      </w:r>
+    </w:p>
+    <w:p>
+      <w:pPr/>
+      <w:r>
+        <w:t xml:space="preserve">Alongside the honest-benchmark study above, a separate full-stack application was built to make an earlier iteration of the O/C model usable outside a notebook: a FastAPI backend serving trained models behind a REST API, and a React/TypeScript frontend for real-time predictions, batch CSV upload, model comparison, and SHAP-based explanation of individual predictions. That iteration used the D1b (Zhang et al. 2022) dataset with simpler random-split validation (test R² = 0.900 for O/C, XGBoost) and a hand-written physics-feature layer (Arrhenius kinetics per pseudo-component, a competitive cellulose pathway, secondary tar-cracking severity, ash-catalysed devolatilisation, and the Modified Dulong formula for heating value).</w:t>
+      </w:r>
+    </w:p>
+    <w:p>
+      <w:pPr/>
+      <w:r>
+        <w:t xml:space="preserve">Read together with Part A of this report, that 0.900 figure is best understood as a random-split number of the kind Section 4 shows to be optimistic for a genuinely new biomass; the grouped-by-biomass evaluation methodology developed here (Section 3.3) is the more defensible standard the application's model should ultimately be re-validated against. The application is kept as a demonstration of deployment engineering — a working interface, not a replacement for the honest evaluation protocol this report establishes.</w:t>
+      </w:r>
+    </w:p>
+    <w:p>
+      <w:pPr/>
+      <w:r>
+        <w:t xml:space="preserve">The deployable tool provides:</w:t>
+      </w:r>
+    </w:p>
+    <w:p>
+      <w:pPr>
+        <w:pStyle w:val="ListParagraph"/>
+        <w:numPr>
+          <w:ilvl w:val="0"/>
+          <w:numId w:val="2"/>
+        </w:numPr>
+        <w:spacing w:after="60"/>
+      </w:pPr>
+      <w:r>
+        <w:t xml:space="preserve">A /predict endpoint returning O/C, secondary properties (H/C, calorific value, oil yield), a 95% confidence interval (GPR/Random Forest), and rule-based physics-validation flags.</w:t>
+      </w:r>
+    </w:p>
+    <w:p>
+      <w:pPr>
+        <w:pStyle w:val="ListParagraph"/>
+        <w:numPr>
+          <w:ilvl w:val="0"/>
+          <w:numId w:val="2"/>
+        </w:numPr>
+        <w:spacing w:after="60"/>
+      </w:pPr>
+      <w:r>
+        <w:t xml:space="preserve">A /batch-predict endpoint for CSV/Excel upload and bulk scoring.</w:t>
+      </w:r>
+    </w:p>
+    <w:p>
+      <w:pPr>
+        <w:pStyle w:val="ListParagraph"/>
+        <w:numPr>
+          <w:ilvl w:val="0"/>
+          <w:numId w:val="2"/>
+        </w:numPr>
+        <w:spacing w:after="60"/>
+      </w:pPr>
+      <w:r>
+        <w:t xml:space="preserve">A /explain endpoint giving per-prediction SHAP attributions translated into plain pyrolysis-chemistry language.</w:t>
+      </w:r>
+    </w:p>
+    <w:p>
+      <w:pPr>
+        <w:pStyle w:val="ListParagraph"/>
+        <w:numPr>
+          <w:ilvl w:val="0"/>
+          <w:numId w:val="2"/>
+        </w:numPr>
+        <w:spacing w:after="60"/>
+      </w:pPr>
+      <w:r>
+        <w:t xml:space="preserve">A /drift-check endpoint flagging inputs outside the training data's observed ranges.</w:t>
+      </w:r>
+    </w:p>
+    <w:p>
+      <w:pPr>
+        <w:pStyle w:val="ListParagraph"/>
+        <w:numPr>
+          <w:ilvl w:val="0"/>
+          <w:numId w:val="2"/>
+        </w:numPr>
+        <w:spacing w:after="60"/>
+      </w:pPr>
+      <w:r>
+        <w:t xml:space="preserve">A model-comparison view running the same input through all seven trained model types side by side.</w:t>
       </w:r>
     </w:p>
     <w:p>

</xml_diff>